<commit_message>
modified:   02_Unsupervised/Dokumente/Hierarchical_Clustering_Leitfaden.docx 	modified:   02_Unsupervised/Dokumente/Hierarchical_Clustering_Leitfaden.pdf 	new file:   02_Unsupervised/Dokumente/generate_clusterprinzip.py 	new file:   02_Unsupervised/Dokumente/generate_linkage_diagrams.py 	deleted:    02_Unsupervised/Dokumente/linkage_methoden.pdf
</commit_message>
<xml_diff>
--- a/02_Unsupervised/Dokumente/Hierarchical_Clustering_Leitfaden.docx
+++ b/02_Unsupervised/Dokumente/Hierarchical_Clustering_Leitfaden.docx
@@ -49,6 +49,9 @@
     <w:p>
       <w:pPr>
         <w:spacing w:after="140"/>
+        <w:rPr>
+          <w:color w:val="1A1A1A"/>
+        </w:rPr>
       </w:pPr>
       <w:r>
         <w:rPr>
@@ -70,6 +73,66 @@
         </w:rPr>
         <w:t xml:space="preserve"> – einordnet. Im Gegensatz zu partitionierenden Verfahren wie K-Means muss die Anzahl der Cluster nicht vorab festgelegt werden; sie ergibt sich aus der Analyse des Dendrogramms.</w:t>
       </w:r>
+    </w:p>
+    <w:p>
+      <w:pPr>
+        <w:spacing w:after="140"/>
+        <w:rPr>
+          <w:color w:val="1A1A1A"/>
+        </w:rPr>
+      </w:pPr>
+      <w:r>
+        <w:rPr>
+          <w:noProof/>
+          <w:color w:val="1A1A1A"/>
+        </w:rPr>
+        <w:drawing>
+          <wp:inline distT="0" distB="0" distL="0" distR="0" wp14:anchorId="2EB6E159" wp14:editId="28102290">
+            <wp:extent cx="6645910" cy="2832735"/>
+            <wp:effectExtent l="0" t="0" r="0" b="0"/>
+            <wp:docPr id="263670483" name="Picture 2"/>
+            <wp:cNvGraphicFramePr>
+              <a:graphicFrameLocks xmlns:a="http://schemas.openxmlformats.org/drawingml/2006/main" noChangeAspect="1"/>
+            </wp:cNvGraphicFramePr>
+            <a:graphic xmlns:a="http://schemas.openxmlformats.org/drawingml/2006/main">
+              <a:graphicData uri="http://schemas.openxmlformats.org/drawingml/2006/picture">
+                <pic:pic xmlns:pic="http://schemas.openxmlformats.org/drawingml/2006/picture">
+                  <pic:nvPicPr>
+                    <pic:cNvPr id="263670483" name="Picture 263670483"/>
+                    <pic:cNvPicPr/>
+                  </pic:nvPicPr>
+                  <pic:blipFill>
+                    <a:blip r:embed="rId7" cstate="print">
+                      <a:extLst>
+                        <a:ext uri="{28A0092B-C50C-407E-A947-70E740481C1C}">
+                          <a14:useLocalDpi xmlns:a14="http://schemas.microsoft.com/office/drawing/2010/main" val="0"/>
+                        </a:ext>
+                      </a:extLst>
+                    </a:blip>
+                    <a:stretch>
+                      <a:fillRect/>
+                    </a:stretch>
+                  </pic:blipFill>
+                  <pic:spPr>
+                    <a:xfrm>
+                      <a:off x="0" y="0"/>
+                      <a:ext cx="6645910" cy="2832735"/>
+                    </a:xfrm>
+                    <a:prstGeom prst="rect">
+                      <a:avLst/>
+                    </a:prstGeom>
+                  </pic:spPr>
+                </pic:pic>
+              </a:graphicData>
+            </a:graphic>
+          </wp:inline>
+        </w:drawing>
+      </w:r>
+    </w:p>
+    <w:p>
+      <w:pPr>
+        <w:spacing w:after="140"/>
+      </w:pPr>
     </w:p>
     <w:p>
       <w:pPr>
@@ -111,8 +174,6 @@
     <w:p>
       <w:pPr>
         <w:spacing w:before="200" w:after="120"/>
-      </w:pPr>
-      <w:r>
         <w:rPr>
           <w:b/>
           <w:bCs/>
@@ -120,6 +181,20 @@
           <w:sz w:val="22"/>
           <w:szCs w:val="22"/>
         </w:rPr>
+      </w:pPr>
+    </w:p>
+    <w:p>
+      <w:pPr>
+        <w:spacing w:before="200" w:after="120"/>
+      </w:pPr>
+      <w:r>
+        <w:rPr>
+          <w:b/>
+          <w:bCs/>
+          <w:color w:val="E8882F"/>
+          <w:sz w:val="22"/>
+          <w:szCs w:val="22"/>
+        </w:rPr>
         <w:t>Divisiv (Top-Down)</w:t>
       </w:r>
     </w:p>
@@ -172,6 +247,7 @@
     <w:p>
       <w:pPr>
         <w:pStyle w:val="Heading1"/>
+        <w:spacing w:before="0" w:after="0"/>
       </w:pPr>
       <w:r>
         <w:lastRenderedPageBreak/>
@@ -181,12 +257,15 @@
     <w:p>
       <w:pPr>
         <w:spacing w:after="140"/>
-      </w:pPr>
-      <w:r>
-        <w:rPr>
-          <w:color w:val="1A1A1A"/>
-        </w:rPr>
-        <w:t xml:space="preserve">Die zentrale Frage beim agglomerativen Clustering lautet: </w:t>
+        <w:rPr>
+          <w:color w:val="1A1A1A"/>
+        </w:rPr>
+      </w:pPr>
+      <w:r>
+        <w:rPr>
+          <w:color w:val="1A1A1A"/>
+        </w:rPr>
+        <w:t xml:space="preserve">Die Frage beim agglomerativen Clustering lautet: </w:t>
       </w:r>
       <w:r>
         <w:rPr>
@@ -201,6 +280,58 @@
           <w:color w:val="1A1A1A"/>
         </w:rPr>
         <w:t xml:space="preserve"> Die Antwort darauf liefert die sogenannte Linkage-Methode. Sie bestimmt maßgeblich die Form, Größe und Qualität der resultierenden Cluster und sollte stets bewusst auf die Datenstruktur abgestimmt werden.</w:t>
+      </w:r>
+    </w:p>
+    <w:p>
+      <w:pPr>
+        <w:spacing w:after="140"/>
+        <w:jc w:val="center"/>
+      </w:pPr>
+      <w:r>
+        <w:rPr>
+          <w:noProof/>
+        </w:rPr>
+        <w:drawing>
+          <wp:inline distT="0" distB="0" distL="0" distR="0" wp14:anchorId="45EFA4D6" wp14:editId="30F7A8B6">
+            <wp:extent cx="6393305" cy="8599016"/>
+            <wp:effectExtent l="0" t="0" r="0" b="0"/>
+            <wp:docPr id="1675355420" name="Picture 1"/>
+            <wp:cNvGraphicFramePr>
+              <a:graphicFrameLocks xmlns:a="http://schemas.openxmlformats.org/drawingml/2006/main" noChangeAspect="1"/>
+            </wp:cNvGraphicFramePr>
+            <a:graphic xmlns:a="http://schemas.openxmlformats.org/drawingml/2006/main">
+              <a:graphicData uri="http://schemas.openxmlformats.org/drawingml/2006/picture">
+                <pic:pic xmlns:pic="http://schemas.openxmlformats.org/drawingml/2006/picture">
+                  <pic:nvPicPr>
+                    <pic:cNvPr id="1675355420" name="Picture 1675355420"/>
+                    <pic:cNvPicPr/>
+                  </pic:nvPicPr>
+                  <pic:blipFill>
+                    <a:blip r:embed="rId8" cstate="print">
+                      <a:extLst>
+                        <a:ext uri="{28A0092B-C50C-407E-A947-70E740481C1C}">
+                          <a14:useLocalDpi xmlns:a14="http://schemas.microsoft.com/office/drawing/2010/main" val="0"/>
+                        </a:ext>
+                      </a:extLst>
+                    </a:blip>
+                    <a:stretch>
+                      <a:fillRect/>
+                    </a:stretch>
+                  </pic:blipFill>
+                  <pic:spPr>
+                    <a:xfrm>
+                      <a:off x="0" y="0"/>
+                      <a:ext cx="6433092" cy="8652529"/>
+                    </a:xfrm>
+                    <a:prstGeom prst="rect">
+                      <a:avLst/>
+                    </a:prstGeom>
+                  </pic:spPr>
+                </pic:pic>
+              </a:graphicData>
+            </a:graphic>
+          </wp:inline>
+        </w:drawing>
       </w:r>
     </w:p>
     <w:p>
@@ -496,16 +627,7 @@
           <w:bCs/>
           <w:color w:val="1A1A1A"/>
         </w:rPr>
-        <w:t>Zuwachs der gesamten Innerhalb-Cluster-</w:t>
-      </w:r>
-      <w:r>
-        <w:rPr>
-          <w:b/>
-          <w:bCs/>
-          <w:color w:val="1A1A1A"/>
-        </w:rPr>
-        <w:lastRenderedPageBreak/>
-        <w:t>Varianz (Within-Cluster Sum of Squares)</w:t>
+        <w:t>Zuwachs der gesamten Innerhalb-Cluster-Varianz (Within-Cluster Sum of Squares)</w:t>
       </w:r>
       <w:r>
         <w:rPr>
@@ -638,6 +760,7 @@
         <w:pStyle w:val="Heading1"/>
       </w:pPr>
       <w:r>
+        <w:lastRenderedPageBreak/>
         <w:t>3  Das Dendrogramm</w:t>
       </w:r>
     </w:p>
@@ -846,7 +969,6 @@
         <w:pStyle w:val="Heading2"/>
       </w:pPr>
       <w:r>
-        <w:lastRenderedPageBreak/>
         <w:t>4.2  Modellierung</w:t>
       </w:r>
     </w:p>
@@ -918,9 +1040,24 @@
     </w:p>
     <w:p>
       <w:pPr>
+        <w:rPr>
+          <w:b/>
+          <w:bCs/>
+          <w:color w:val="1B5E7B"/>
+          <w:sz w:val="32"/>
+          <w:szCs w:val="32"/>
+        </w:rPr>
+      </w:pPr>
+      <w:r>
+        <w:br w:type="page"/>
+      </w:r>
+    </w:p>
+    <w:p>
+      <w:pPr>
         <w:pStyle w:val="Heading1"/>
       </w:pPr>
       <w:r>
+        <w:lastRenderedPageBreak/>
         <w:t>5  Algorithmenvergleich</w:t>
       </w:r>
     </w:p>
@@ -937,7 +1074,7 @@
     </w:p>
     <w:tbl>
       <w:tblPr>
-        <w:tblW w:w="9026" w:type="dxa"/>
+        <w:tblW w:w="10489" w:type="dxa"/>
         <w:tblBorders>
           <w:top w:val="single" w:sz="4" w:space="0" w:color="auto"/>
           <w:left w:val="single" w:sz="4" w:space="0" w:color="auto"/>
@@ -953,21 +1090,15 @@
         <w:tblLook w:val="0000" w:firstRow="0" w:lastRow="0" w:firstColumn="0" w:lastColumn="0" w:noHBand="0" w:noVBand="0"/>
       </w:tblPr>
       <w:tblGrid>
-        <w:gridCol w:w="1800"/>
-        <w:gridCol w:w="2400"/>
-        <w:gridCol w:w="2400"/>
-        <w:gridCol w:w="2426"/>
+        <w:gridCol w:w="1559"/>
+        <w:gridCol w:w="2976"/>
+        <w:gridCol w:w="2694"/>
+        <w:gridCol w:w="3260"/>
       </w:tblGrid>
       <w:tr>
-        <w:tblPrEx>
-          <w:tblCellMar>
-            <w:top w:w="0" w:type="dxa"/>
-            <w:bottom w:w="0" w:type="dxa"/>
-          </w:tblCellMar>
-        </w:tblPrEx>
         <w:tc>
           <w:tcPr>
-            <w:tcW w:w="1800" w:type="dxa"/>
+            <w:tcW w:w="1559" w:type="dxa"/>
             <w:tcBorders>
               <w:top w:val="single" w:sz="1" w:space="0" w:color="B0C4CE"/>
               <w:left w:val="single" w:sz="1" w:space="0" w:color="B0C4CE"/>
@@ -998,7 +1129,7 @@
         </w:tc>
         <w:tc>
           <w:tcPr>
-            <w:tcW w:w="2400" w:type="dxa"/>
+            <w:tcW w:w="2976" w:type="dxa"/>
             <w:tcBorders>
               <w:top w:val="single" w:sz="1" w:space="0" w:color="B0C4CE"/>
               <w:left w:val="single" w:sz="1" w:space="0" w:color="B0C4CE"/>
@@ -1029,7 +1160,7 @@
         </w:tc>
         <w:tc>
           <w:tcPr>
-            <w:tcW w:w="2400" w:type="dxa"/>
+            <w:tcW w:w="2694" w:type="dxa"/>
             <w:tcBorders>
               <w:top w:val="single" w:sz="1" w:space="0" w:color="B0C4CE"/>
               <w:left w:val="single" w:sz="1" w:space="0" w:color="B0C4CE"/>
@@ -1060,7 +1191,7 @@
         </w:tc>
         <w:tc>
           <w:tcPr>
-            <w:tcW w:w="2426" w:type="dxa"/>
+            <w:tcW w:w="3260" w:type="dxa"/>
             <w:tcBorders>
               <w:top w:val="single" w:sz="1" w:space="0" w:color="B0C4CE"/>
               <w:left w:val="single" w:sz="1" w:space="0" w:color="B0C4CE"/>
@@ -1091,15 +1222,9 @@
         </w:tc>
       </w:tr>
       <w:tr>
-        <w:tblPrEx>
-          <w:tblCellMar>
-            <w:top w:w="0" w:type="dxa"/>
-            <w:bottom w:w="0" w:type="dxa"/>
-          </w:tblCellMar>
-        </w:tblPrEx>
         <w:tc>
           <w:tcPr>
-            <w:tcW w:w="1800" w:type="dxa"/>
+            <w:tcW w:w="1559" w:type="dxa"/>
             <w:tcBorders>
               <w:top w:val="single" w:sz="1" w:space="0" w:color="B0C4CE"/>
               <w:left w:val="single" w:sz="1" w:space="0" w:color="B0C4CE"/>
@@ -1130,7 +1255,7 @@
         </w:tc>
         <w:tc>
           <w:tcPr>
-            <w:tcW w:w="2400" w:type="dxa"/>
+            <w:tcW w:w="2976" w:type="dxa"/>
             <w:tcBorders>
               <w:top w:val="single" w:sz="1" w:space="0" w:color="B0C4CE"/>
               <w:left w:val="single" w:sz="1" w:space="0" w:color="B0C4CE"/>
@@ -1170,7 +1295,7 @@
         </w:tc>
         <w:tc>
           <w:tcPr>
-            <w:tcW w:w="2400" w:type="dxa"/>
+            <w:tcW w:w="2694" w:type="dxa"/>
             <w:tcBorders>
               <w:top w:val="single" w:sz="1" w:space="0" w:color="B0C4CE"/>
               <w:left w:val="single" w:sz="1" w:space="0" w:color="B0C4CE"/>
@@ -1210,7 +1335,7 @@
         </w:tc>
         <w:tc>
           <w:tcPr>
-            <w:tcW w:w="2426" w:type="dxa"/>
+            <w:tcW w:w="3260" w:type="dxa"/>
             <w:tcBorders>
               <w:top w:val="single" w:sz="1" w:space="0" w:color="B0C4CE"/>
               <w:left w:val="single" w:sz="1" w:space="0" w:color="B0C4CE"/>
@@ -1239,15 +1364,9 @@
         </w:tc>
       </w:tr>
       <w:tr>
-        <w:tblPrEx>
-          <w:tblCellMar>
-            <w:top w:w="0" w:type="dxa"/>
-            <w:bottom w:w="0" w:type="dxa"/>
-          </w:tblCellMar>
-        </w:tblPrEx>
         <w:tc>
           <w:tcPr>
-            <w:tcW w:w="1800" w:type="dxa"/>
+            <w:tcW w:w="1559" w:type="dxa"/>
             <w:tcBorders>
               <w:top w:val="single" w:sz="1" w:space="0" w:color="B0C4CE"/>
               <w:left w:val="single" w:sz="1" w:space="0" w:color="B0C4CE"/>
@@ -1278,7 +1397,7 @@
         </w:tc>
         <w:tc>
           <w:tcPr>
-            <w:tcW w:w="2400" w:type="dxa"/>
+            <w:tcW w:w="2976" w:type="dxa"/>
             <w:tcBorders>
               <w:top w:val="single" w:sz="1" w:space="0" w:color="B0C4CE"/>
               <w:left w:val="single" w:sz="1" w:space="0" w:color="B0C4CE"/>
@@ -1318,7 +1437,7 @@
         </w:tc>
         <w:tc>
           <w:tcPr>
-            <w:tcW w:w="2400" w:type="dxa"/>
+            <w:tcW w:w="2694" w:type="dxa"/>
             <w:tcBorders>
               <w:top w:val="single" w:sz="1" w:space="0" w:color="B0C4CE"/>
               <w:left w:val="single" w:sz="1" w:space="0" w:color="B0C4CE"/>
@@ -1358,7 +1477,7 @@
         </w:tc>
         <w:tc>
           <w:tcPr>
-            <w:tcW w:w="2426" w:type="dxa"/>
+            <w:tcW w:w="3260" w:type="dxa"/>
             <w:tcBorders>
               <w:top w:val="single" w:sz="1" w:space="0" w:color="B0C4CE"/>
               <w:left w:val="single" w:sz="1" w:space="0" w:color="B0C4CE"/>
@@ -1398,15 +1517,9 @@
         </w:tc>
       </w:tr>
       <w:tr>
-        <w:tblPrEx>
-          <w:tblCellMar>
-            <w:top w:w="0" w:type="dxa"/>
-            <w:bottom w:w="0" w:type="dxa"/>
-          </w:tblCellMar>
-        </w:tblPrEx>
         <w:tc>
           <w:tcPr>
-            <w:tcW w:w="1800" w:type="dxa"/>
+            <w:tcW w:w="1559" w:type="dxa"/>
             <w:tcBorders>
               <w:top w:val="single" w:sz="1" w:space="0" w:color="B0C4CE"/>
               <w:left w:val="single" w:sz="1" w:space="0" w:color="B0C4CE"/>
@@ -1437,7 +1550,7 @@
         </w:tc>
         <w:tc>
           <w:tcPr>
-            <w:tcW w:w="2400" w:type="dxa"/>
+            <w:tcW w:w="2976" w:type="dxa"/>
             <w:tcBorders>
               <w:top w:val="single" w:sz="1" w:space="0" w:color="B0C4CE"/>
               <w:left w:val="single" w:sz="1" w:space="0" w:color="B0C4CE"/>
@@ -1477,7 +1590,7 @@
         </w:tc>
         <w:tc>
           <w:tcPr>
-            <w:tcW w:w="2400" w:type="dxa"/>
+            <w:tcW w:w="2694" w:type="dxa"/>
             <w:tcBorders>
               <w:top w:val="single" w:sz="1" w:space="0" w:color="B0C4CE"/>
               <w:left w:val="single" w:sz="1" w:space="0" w:color="B0C4CE"/>
@@ -1517,7 +1630,7 @@
         </w:tc>
         <w:tc>
           <w:tcPr>
-            <w:tcW w:w="2426" w:type="dxa"/>
+            <w:tcW w:w="3260" w:type="dxa"/>
             <w:tcBorders>
               <w:top w:val="single" w:sz="1" w:space="0" w:color="B0C4CE"/>
               <w:left w:val="single" w:sz="1" w:space="0" w:color="B0C4CE"/>
@@ -1546,15 +1659,9 @@
         </w:tc>
       </w:tr>
       <w:tr>
-        <w:tblPrEx>
-          <w:tblCellMar>
-            <w:top w:w="0" w:type="dxa"/>
-            <w:bottom w:w="0" w:type="dxa"/>
-          </w:tblCellMar>
-        </w:tblPrEx>
         <w:tc>
           <w:tcPr>
-            <w:tcW w:w="1800" w:type="dxa"/>
+            <w:tcW w:w="1559" w:type="dxa"/>
             <w:tcBorders>
               <w:top w:val="single" w:sz="1" w:space="0" w:color="B0C4CE"/>
               <w:left w:val="single" w:sz="1" w:space="0" w:color="B0C4CE"/>
@@ -1598,7 +1705,7 @@
         </w:tc>
         <w:tc>
           <w:tcPr>
-            <w:tcW w:w="2400" w:type="dxa"/>
+            <w:tcW w:w="2976" w:type="dxa"/>
             <w:tcBorders>
               <w:top w:val="single" w:sz="1" w:space="0" w:color="B0C4CE"/>
               <w:left w:val="single" w:sz="1" w:space="0" w:color="B0C4CE"/>
@@ -1638,7 +1745,7 @@
         </w:tc>
         <w:tc>
           <w:tcPr>
-            <w:tcW w:w="2400" w:type="dxa"/>
+            <w:tcW w:w="2694" w:type="dxa"/>
             <w:tcBorders>
               <w:top w:val="single" w:sz="1" w:space="0" w:color="B0C4CE"/>
               <w:left w:val="single" w:sz="1" w:space="0" w:color="B0C4CE"/>
@@ -1664,7 +1771,12 @@
               <w:t>Verzerren die</w:t>
             </w:r>
             <w:r>
-              <w:br/>
+              <w:rPr>
+                <w:color w:val="1A1A1A"/>
+                <w:sz w:val="20"/>
+                <w:szCs w:val="20"/>
+              </w:rPr>
+              <w:t xml:space="preserve"> </w:t>
             </w:r>
             <w:r>
               <w:rPr>
@@ -1678,7 +1790,7 @@
         </w:tc>
         <w:tc>
           <w:tcPr>
-            <w:tcW w:w="2426" w:type="dxa"/>
+            <w:tcW w:w="3260" w:type="dxa"/>
             <w:tcBorders>
               <w:top w:val="single" w:sz="1" w:space="0" w:color="B0C4CE"/>
               <w:left w:val="single" w:sz="1" w:space="0" w:color="B0C4CE"/>
@@ -1704,7 +1816,12 @@
               <w:t>Werden als Rauschen</w:t>
             </w:r>
             <w:r>
-              <w:br/>
+              <w:rPr>
+                <w:color w:val="1A1A1A"/>
+                <w:sz w:val="20"/>
+                <w:szCs w:val="20"/>
+              </w:rPr>
+              <w:t xml:space="preserve"> </w:t>
             </w:r>
             <w:r>
               <w:rPr>
@@ -1718,15 +1835,9 @@
         </w:tc>
       </w:tr>
       <w:tr>
-        <w:tblPrEx>
-          <w:tblCellMar>
-            <w:top w:w="0" w:type="dxa"/>
-            <w:bottom w:w="0" w:type="dxa"/>
-          </w:tblCellMar>
-        </w:tblPrEx>
         <w:tc>
           <w:tcPr>
-            <w:tcW w:w="1800" w:type="dxa"/>
+            <w:tcW w:w="1559" w:type="dxa"/>
             <w:tcBorders>
               <w:top w:val="single" w:sz="1" w:space="0" w:color="B0C4CE"/>
               <w:left w:val="single" w:sz="1" w:space="0" w:color="B0C4CE"/>
@@ -1757,7 +1868,7 @@
         </w:tc>
         <w:tc>
           <w:tcPr>
-            <w:tcW w:w="2400" w:type="dxa"/>
+            <w:tcW w:w="2976" w:type="dxa"/>
             <w:tcBorders>
               <w:top w:val="single" w:sz="1" w:space="0" w:color="B0C4CE"/>
               <w:left w:val="single" w:sz="1" w:space="0" w:color="B0C4CE"/>
@@ -1783,7 +1894,12 @@
               <w:t>O(n² log n)</w:t>
             </w:r>
             <w:r>
-              <w:br/>
+              <w:rPr>
+                <w:color w:val="1A1A1A"/>
+                <w:sz w:val="20"/>
+                <w:szCs w:val="20"/>
+              </w:rPr>
+              <w:t xml:space="preserve"> </w:t>
             </w:r>
             <w:r>
               <w:rPr>
@@ -1797,7 +1913,7 @@
         </w:tc>
         <w:tc>
           <w:tcPr>
-            <w:tcW w:w="2400" w:type="dxa"/>
+            <w:tcW w:w="2694" w:type="dxa"/>
             <w:tcBorders>
               <w:top w:val="single" w:sz="1" w:space="0" w:color="B0C4CE"/>
               <w:left w:val="single" w:sz="1" w:space="0" w:color="B0C4CE"/>
@@ -1823,7 +1939,12 @@
               <w:t>O(n · k · t)</w:t>
             </w:r>
             <w:r>
-              <w:br/>
+              <w:rPr>
+                <w:color w:val="1A1A1A"/>
+                <w:sz w:val="20"/>
+                <w:szCs w:val="20"/>
+              </w:rPr>
+              <w:t xml:space="preserve"> </w:t>
             </w:r>
             <w:r>
               <w:rPr>
@@ -1837,7 +1958,7 @@
         </w:tc>
         <w:tc>
           <w:tcPr>
-            <w:tcW w:w="2426" w:type="dxa"/>
+            <w:tcW w:w="3260" w:type="dxa"/>
             <w:tcBorders>
               <w:top w:val="single" w:sz="1" w:space="0" w:color="B0C4CE"/>
               <w:left w:val="single" w:sz="1" w:space="0" w:color="B0C4CE"/>
@@ -1863,7 +1984,12 @@
               <w:t>O(n log n)</w:t>
             </w:r>
             <w:r>
-              <w:br/>
+              <w:rPr>
+                <w:color w:val="1A1A1A"/>
+                <w:sz w:val="20"/>
+                <w:szCs w:val="20"/>
+              </w:rPr>
+              <w:t xml:space="preserve"> </w:t>
             </w:r>
             <w:r>
               <w:rPr>
@@ -1966,7 +2092,6 @@
         <w:rPr>
           <w:color w:val="1A1A1A"/>
         </w:rPr>
-        <w:lastRenderedPageBreak/>
         <w:t>Ward’s Methode auf halbmondförmige Daten angewendet zerschneidet die natürliche Struktur, da sie sphärische Cluster bevorzugt. Umgekehrt erzeugt Single Linkage auf kompakten, kugelartigen Daten unerwünschte Kettenstrukturen. Die Linkage-Methode sollte stets auf die erwartete Geometrie der Daten abgestimmt werden.</w:t>
       </w:r>
     </w:p>
@@ -2040,39 +2165,14 @@
     </w:p>
     <w:p>
       <w:pPr>
-        <w:pStyle w:val="Heading1"/>
-      </w:pPr>
-      <w:r>
-        <w:t>7  Zusammenfassung</w:t>
-      </w:r>
-    </w:p>
-    <w:p>
-      <w:pPr>
         <w:spacing w:after="140"/>
       </w:pPr>
-      <w:r>
-        <w:rPr>
-          <w:color w:val="1A1A1A"/>
-        </w:rPr>
-        <w:t>Hierarchisches Clustering ist ein vielseitiges, exploratives Verfahren, das insbesondere dann seine Stärken ausspielt, wenn die Clusteranzahl unbekannt ist und die Datenstruktur visuell untersucht werden soll. Die Wahl der Linkage-Methode hat entscheidenden Einfluss auf das Ergebnis und sollte stets bewusst und datengetrieben erfolgen. In Kombination mit sorgfältiger Datenvorbereitung – vor allem der Skalierung – und einer strukturierten Ergebnisinterpretation liefert das Verfahren zuverlässige und interpretierbare Gruppenstrukturen.</w:t>
-      </w:r>
-    </w:p>
-    <w:p>
-      <w:pPr>
-        <w:spacing w:after="140"/>
-      </w:pPr>
-      <w:r>
-        <w:rPr>
-          <w:color w:val="1A1A1A"/>
-        </w:rPr>
-        <w:t>Für große Datensätze oder spezielle Anforderungen (beliebige Clusterformen, Ausreißerbehandlung) sollte stets geprüft werden, ob alternative Verfahren wie K-Means, DBSCAN oder HDBSCAN besser geeignet sind.</w:t>
-      </w:r>
     </w:p>
     <w:sectPr>
-      <w:headerReference w:type="default" r:id="rId7"/>
-      <w:footerReference w:type="default" r:id="rId8"/>
+      <w:headerReference w:type="default" r:id="rId9"/>
+      <w:footerReference w:type="default" r:id="rId10"/>
       <w:pgSz w:w="11906" w:h="16838"/>
-      <w:pgMar w:top="1440" w:right="1440" w:bottom="1440" w:left="1440" w:header="708" w:footer="708" w:gutter="0"/>
+      <w:pgMar w:top="720" w:right="720" w:bottom="720" w:left="720" w:header="708" w:footer="708" w:gutter="0"/>
       <w:cols w:space="720"/>
       <w:docGrid w:linePitch="360"/>
     </w:sectPr>

</xml_diff>